<commit_message>
Add website update report workflow
</commit_message>
<xml_diff>
--- a/docs/handbooks/MediaKids-Deep-Handoff-Summary.docx
+++ b/docs/handbooks/MediaKids-Deep-Handoff-Summary.docx
@@ -251,6 +251,34 @@
           <w:sz w:val="21"/>
         </w:rPr>
         <w:t>ต้องมีคู่มือ Word สำหรับเจ้าของเครื่อง Mac และคู่มือ Word สำหรับทีมงาน/คนอื่น</w:t>
+      </w:r>
+    </w:p>
+    <w:p>
+      <w:pPr>
+        <w:pStyle w:val="ListBullet"/>
+        <w:spacing w:after="60"/>
+      </w:pPr>
+      <w:r>
+        <w:rPr>
+          <w:rFonts w:ascii="Noto Sans Thai" w:hAnsi="Noto Sans Thai" w:eastAsia="Noto Sans Thai"/>
+          <w:color w:val="1D1D1F"/>
+          <w:sz w:val="21"/>
+        </w:rPr>
+        <w:t>หลังแก้เว็บจริงเสร็จ อยากให้ Codex ถามก่อนว่าจะทำรายงานสรุปส่งหัวหน้าหรือไม่ โดยรายงานต้องอ่านง่าย ไม่เน้นโค้ด และบอกว่าเว็บดีขึ้นอย่างไร</w:t>
+      </w:r>
+    </w:p>
+    <w:p>
+      <w:pPr>
+        <w:pStyle w:val="ListBullet"/>
+        <w:spacing w:after="60"/>
+      </w:pPr>
+      <w:r>
+        <w:rPr>
+          <w:rFonts w:ascii="Noto Sans Thai" w:hAnsi="Noto Sans Thai" w:eastAsia="Noto Sans Thai"/>
+          <w:color w:val="1D1D1F"/>
+          <w:sz w:val="21"/>
+        </w:rPr>
+        <w:t>รายงานส่งหัวหน้าใช้กับงานเว็บจริง เช่น รูป แกลเลอรี UI วิดีโอ popup ความปลอดภัย SEO หรือ performance ไม่ใช้กับงานระบบภายใน เช่น skill, SSH, workflow docs หรือคู่มือ เว้นแต่เจ้าของขอ</w:t>
       </w:r>
     </w:p>
     <w:p>
@@ -679,6 +707,8 @@
         <w:t>.agent/workflows/ui-design-system.md</w:t>
         <w:br/>
         <w:t>.agent/workflows/external-worker.md</w:t>
+        <w:br/>
+        <w:t>.agent/workflows/website-update-report.md</w:t>
       </w:r>
     </w:p>
     <w:p>
@@ -806,6 +836,28 @@
           <w:sz w:val="21"/>
         </w:rPr>
         <w:t>: วิธีให้คนอื่นหรือ AI อื่นทำงานจากคอมอื่น</w:t>
+      </w:r>
+    </w:p>
+    <w:p>
+      <w:pPr>
+        <w:pStyle w:val="ListBullet"/>
+        <w:spacing w:after="60"/>
+      </w:pPr>
+      <w:r>
+        <w:rPr>
+          <w:rFonts w:ascii="Courier New" w:hAnsi="Courier New"/>
+          <w:color w:val="0066CC"/>
+          <w:sz w:val="19"/>
+        </w:rPr>
+        <w:t>website-update-report.md</w:t>
+      </w:r>
+      <w:r>
+        <w:rPr>
+          <w:rFonts w:ascii="Noto Sans Thai" w:hAnsi="Noto Sans Thai" w:eastAsia="Noto Sans Thai"/>
+          <w:color w:val="1D1D1F"/>
+          <w:sz w:val="21"/>
+        </w:rPr>
+        <w:t>: กฎทำรายงานสรุปการอัปเดตเว็บไซต์สำหรับส่งหัวหน้า</w:t>
       </w:r>
     </w:p>
     <w:p>
@@ -1056,6 +1108,8 @@
         <w:t>docs/handbooks/MediaKids-Mac-Owner-Guide.md</w:t>
         <w:br/>
         <w:t>docs/handbooks/MediaKids-Mac-Owner-Guide.docx</w:t>
+        <w:br/>
+        <w:t>docs/reports/README.md</w:t>
       </w:r>
     </w:p>
     <w:p>
@@ -1094,6 +1148,28 @@
           <w:sz w:val="21"/>
         </w:rPr>
         <w:t>คู่มือ Mac ใช้เมื่อเจ้าของเครื่องขอ “คู่มือแมค”</w:t>
+      </w:r>
+    </w:p>
+    <w:p>
+      <w:pPr>
+        <w:pStyle w:val="ListBullet"/>
+        <w:spacing w:after="60"/>
+      </w:pPr>
+      <w:r>
+        <w:rPr>
+          <w:rFonts w:ascii="Courier New" w:hAnsi="Courier New"/>
+          <w:color w:val="0066CC"/>
+          <w:sz w:val="19"/>
+        </w:rPr>
+        <w:t>docs/reports/</w:t>
+      </w:r>
+      <w:r>
+        <w:rPr>
+          <w:rFonts w:ascii="Noto Sans Thai" w:hAnsi="Noto Sans Thai" w:eastAsia="Noto Sans Thai"/>
+          <w:color w:val="1D1D1F"/>
+          <w:sz w:val="21"/>
+        </w:rPr>
+        <w:t xml:space="preserve"> ใช้เก็บรายงานสรุปการอัปเดตเว็บไซต์ที่เจ้าของขอเพื่อส่งหัวหน้า</w:t>
       </w:r>
     </w:p>
     <w:p>
@@ -1173,6 +1249,8 @@
         <w:br/>
         <w:t>references/popup-workflow.md</w:t>
         <w:br/>
+        <w:t>references/website-update-report.md</w:t>
+        <w:br/>
         <w:t>references/handoff-new-chat.md</w:t>
         <w:br/>
         <w:t>references/external-worker.md</w:t>
@@ -1247,6 +1325,20 @@
       </w:r>
     </w:p>
     <w:p>
+      <w:pPr>
+        <w:pStyle w:val="ListBullet"/>
+        <w:spacing w:after="60"/>
+      </w:pPr>
+      <w:r>
+        <w:rPr>
+          <w:rFonts w:ascii="Noto Sans Thai" w:hAnsi="Noto Sans Thai" w:eastAsia="Noto Sans Thai"/>
+          <w:color w:val="1D1D1F"/>
+          <w:sz w:val="21"/>
+        </w:rPr>
+        <w:t>หลังงานเว็บจริงเสร็จ จะถามเรื่องรายงานสรุปส่งหัวหน้า แต่ไม่ถามสำหรับงานระบบภายใน</w:t>
+      </w:r>
+    </w:p>
+    <w:p>
       <w:r>
         <w:rPr>
           <w:rFonts w:ascii="Noto Sans Thai" w:hAnsi="Noto Sans Thai" w:eastAsia="Noto Sans Thai"/>
@@ -2969,7 +3061,260 @@
         <w:pStyle w:val="Heading1"/>
       </w:pPr>
       <w:r>
-        <w:t>10. ถ้า Mac เครื่องนี้เสียหรือเปลี่ยนเครื่องกะทันหัน</w:t>
+        <w:t>10. รายงานสรุปส่งหัวหน้า</w:t>
+      </w:r>
+    </w:p>
+    <w:p>
+      <w:r>
+        <w:rPr>
+          <w:rFonts w:ascii="Noto Sans Thai" w:hAnsi="Noto Sans Thai" w:eastAsia="Noto Sans Thai"/>
+          <w:color w:val="1D1D1F"/>
+          <w:sz w:val="21"/>
+        </w:rPr>
+        <w:t>หลังจากงานที่แก้เว็บจริงเสร็จ Codex ต้องถาม:</w:t>
+      </w:r>
+    </w:p>
+    <w:p>
+      <w:pPr>
+        <w:shd w:fill="F5F7FA"/>
+        <w:spacing w:before="60" w:after="160"/>
+        <w:ind w:left="259" w:right="259"/>
+      </w:pPr>
+      <w:r>
+        <w:rPr>
+          <w:rFonts w:ascii="Courier New" w:hAnsi="Courier New" w:eastAsia="Noto Sans Thai"/>
+          <w:color w:val="1D1D1F"/>
+          <w:sz w:val="18"/>
+        </w:rPr>
+        <w:t>ต้องการให้ผมทำรายงานสรุปการอัปเดตเว็บไซต์สำหรับส่งหัวหน้าไหมครับ?</w:t>
+      </w:r>
+    </w:p>
+    <w:p>
+      <w:r>
+        <w:rPr>
+          <w:rFonts w:ascii="Noto Sans Thai" w:hAnsi="Noto Sans Thai" w:eastAsia="Noto Sans Thai"/>
+          <w:color w:val="1D1D1F"/>
+          <w:sz w:val="21"/>
+        </w:rPr>
+        <w:t>ให้ถามเมื่อเป็นงานที่หัวหน้าควรรู้ เช่น:</w:t>
+      </w:r>
+    </w:p>
+    <w:p>
+      <w:pPr>
+        <w:pStyle w:val="ListBullet"/>
+        <w:spacing w:after="60"/>
+      </w:pPr>
+      <w:r>
+        <w:rPr>
+          <w:rFonts w:ascii="Noto Sans Thai" w:hAnsi="Noto Sans Thai" w:eastAsia="Noto Sans Thai"/>
+          <w:color w:val="1D1D1F"/>
+          <w:sz w:val="21"/>
+        </w:rPr>
+        <w:t>เพิ่มรูป อัลบั้ม หรือแกลเลอรี</w:t>
+      </w:r>
+    </w:p>
+    <w:p>
+      <w:pPr>
+        <w:pStyle w:val="ListBullet"/>
+        <w:spacing w:after="60"/>
+      </w:pPr>
+      <w:r>
+        <w:rPr>
+          <w:rFonts w:ascii="Noto Sans Thai" w:hAnsi="Noto Sans Thai" w:eastAsia="Noto Sans Thai"/>
+          <w:color w:val="1D1D1F"/>
+          <w:sz w:val="21"/>
+        </w:rPr>
+        <w:t>เพิ่มหรือแก้ section หน้าเว็บ</w:t>
+      </w:r>
+    </w:p>
+    <w:p>
+      <w:pPr>
+        <w:pStyle w:val="ListBullet"/>
+        <w:spacing w:after="60"/>
+      </w:pPr>
+      <w:r>
+        <w:rPr>
+          <w:rFonts w:ascii="Noto Sans Thai" w:hAnsi="Noto Sans Thai" w:eastAsia="Noto Sans Thai"/>
+          <w:color w:val="1D1D1F"/>
+          <w:sz w:val="21"/>
+        </w:rPr>
+        <w:t>ปรับ UI/UX</w:t>
+      </w:r>
+    </w:p>
+    <w:p>
+      <w:pPr>
+        <w:pStyle w:val="ListBullet"/>
+        <w:spacing w:after="60"/>
+      </w:pPr>
+      <w:r>
+        <w:rPr>
+          <w:rFonts w:ascii="Noto Sans Thai" w:hAnsi="Noto Sans Thai" w:eastAsia="Noto Sans Thai"/>
+          <w:color w:val="1D1D1F"/>
+          <w:sz w:val="21"/>
+        </w:rPr>
+        <w:t>เพิ่มวิดีโอหรือ popup campaign</w:t>
+      </w:r>
+    </w:p>
+    <w:p>
+      <w:pPr>
+        <w:pStyle w:val="ListBullet"/>
+        <w:spacing w:after="60"/>
+      </w:pPr>
+      <w:r>
+        <w:rPr>
+          <w:rFonts w:ascii="Noto Sans Thai" w:hAnsi="Noto Sans Thai" w:eastAsia="Noto Sans Thai"/>
+          <w:color w:val="1D1D1F"/>
+          <w:sz w:val="21"/>
+        </w:rPr>
+        <w:t>ปรับความปลอดภัย SEO performance accessibility หรือ broken links</w:t>
+      </w:r>
+    </w:p>
+    <w:p>
+      <w:r>
+        <w:rPr>
+          <w:rFonts w:ascii="Noto Sans Thai" w:hAnsi="Noto Sans Thai" w:eastAsia="Noto Sans Thai"/>
+          <w:color w:val="1D1D1F"/>
+          <w:sz w:val="21"/>
+        </w:rPr>
+        <w:t>ไม่ต้องถามเมื่อเป็นงานระบบภายใน เช่น:</w:t>
+      </w:r>
+    </w:p>
+    <w:p>
+      <w:pPr>
+        <w:pStyle w:val="ListBullet"/>
+        <w:spacing w:after="60"/>
+      </w:pPr>
+      <w:r>
+        <w:rPr>
+          <w:rFonts w:ascii="Noto Sans Thai" w:hAnsi="Noto Sans Thai" w:eastAsia="Noto Sans Thai"/>
+          <w:color w:val="1D1D1F"/>
+          <w:sz w:val="21"/>
+        </w:rPr>
+        <w:t>สร้างหรือแก้ skill</w:t>
+      </w:r>
+    </w:p>
+    <w:p>
+      <w:pPr>
+        <w:pStyle w:val="ListBullet"/>
+        <w:spacing w:after="60"/>
+      </w:pPr>
+      <w:r>
+        <w:rPr>
+          <w:rFonts w:ascii="Noto Sans Thai" w:hAnsi="Noto Sans Thai" w:eastAsia="Noto Sans Thai"/>
+          <w:color w:val="1D1D1F"/>
+          <w:sz w:val="21"/>
+        </w:rPr>
+        <w:t>ตั้ง GitHub/SSH</w:t>
+      </w:r>
+    </w:p>
+    <w:p>
+      <w:pPr>
+        <w:pStyle w:val="ListBullet"/>
+        <w:spacing w:after="60"/>
+      </w:pPr>
+      <w:r>
+        <w:rPr>
+          <w:rFonts w:ascii="Noto Sans Thai" w:hAnsi="Noto Sans Thai" w:eastAsia="Noto Sans Thai"/>
+          <w:color w:val="1D1D1F"/>
+          <w:sz w:val="21"/>
+        </w:rPr>
+        <w:t>แก้ workflow docs</w:t>
+      </w:r>
+    </w:p>
+    <w:p>
+      <w:pPr>
+        <w:pStyle w:val="ListBullet"/>
+        <w:spacing w:after="60"/>
+      </w:pPr>
+      <w:r>
+        <w:rPr>
+          <w:rFonts w:ascii="Noto Sans Thai" w:hAnsi="Noto Sans Thai" w:eastAsia="Noto Sans Thai"/>
+          <w:color w:val="1D1D1F"/>
+          <w:sz w:val="21"/>
+        </w:rPr>
+        <w:t>ทำคู่มือ</w:t>
+      </w:r>
+    </w:p>
+    <w:p>
+      <w:pPr>
+        <w:pStyle w:val="ListBullet"/>
+        <w:spacing w:after="60"/>
+      </w:pPr>
+      <w:r>
+        <w:rPr>
+          <w:rFonts w:ascii="Noto Sans Thai" w:hAnsi="Noto Sans Thai" w:eastAsia="Noto Sans Thai"/>
+          <w:color w:val="1D1D1F"/>
+          <w:sz w:val="21"/>
+        </w:rPr>
+        <w:t>ดูแล branch/PR</w:t>
+      </w:r>
+    </w:p>
+    <w:p>
+      <w:r>
+        <w:rPr>
+          <w:rFonts w:ascii="Noto Sans Thai" w:hAnsi="Noto Sans Thai" w:eastAsia="Noto Sans Thai"/>
+          <w:color w:val="1D1D1F"/>
+          <w:sz w:val="21"/>
+        </w:rPr>
+        <w:t>ถ้าเจ้าของต้องการรายงาน ให้ใช้:</w:t>
+      </w:r>
+    </w:p>
+    <w:p>
+      <w:pPr>
+        <w:shd w:fill="F5F7FA"/>
+        <w:spacing w:before="60" w:after="160"/>
+        <w:ind w:left="259" w:right="259"/>
+      </w:pPr>
+      <w:r>
+        <w:rPr>
+          <w:rFonts w:ascii="Courier New" w:hAnsi="Courier New" w:eastAsia="Noto Sans Thai"/>
+          <w:color w:val="1D1D1F"/>
+          <w:sz w:val="18"/>
+        </w:rPr>
+        <w:t>.agent/workflows/website-update-report.md</w:t>
+      </w:r>
+    </w:p>
+    <w:p>
+      <w:r>
+        <w:rPr>
+          <w:rFonts w:ascii="Noto Sans Thai" w:hAnsi="Noto Sans Thai" w:eastAsia="Noto Sans Thai"/>
+          <w:color w:val="1D1D1F"/>
+          <w:sz w:val="21"/>
+        </w:rPr>
+        <w:t>และบันทึกไฟล์ใน:</w:t>
+      </w:r>
+    </w:p>
+    <w:p>
+      <w:pPr>
+        <w:shd w:fill="F5F7FA"/>
+        <w:spacing w:before="60" w:after="160"/>
+        <w:ind w:left="259" w:right="259"/>
+      </w:pPr>
+      <w:r>
+        <w:rPr>
+          <w:rFonts w:ascii="Courier New" w:hAnsi="Courier New" w:eastAsia="Noto Sans Thai"/>
+          <w:color w:val="1D1D1F"/>
+          <w:sz w:val="18"/>
+        </w:rPr>
+        <w:t>docs/reports/</w:t>
+      </w:r>
+    </w:p>
+    <w:p>
+      <w:r>
+        <w:rPr>
+          <w:rFonts w:ascii="Noto Sans Thai" w:hAnsi="Noto Sans Thai" w:eastAsia="Noto Sans Thai"/>
+          <w:color w:val="1D1D1F"/>
+          <w:sz w:val="21"/>
+        </w:rPr>
+        <w:t>รายงานควรเขียนเป็นภาษาคน อ่านง่าย ส่งหัวหน้าได้ทันที และสรุปว่าเว็บดีขึ้นอย่างไร ไม่ใช่แค่บอกว่าแก้ไฟล์อะไร</w:t>
+      </w:r>
+    </w:p>
+    <w:p>
+      <w:pPr>
+        <w:pStyle w:val="Heading1"/>
+      </w:pPr>
+      <w:r>
+        <w:t>11. ถ้า Mac เครื่องนี้เสียหรือเปลี่ยนเครื่องกะทันหัน</w:t>
       </w:r>
     </w:p>
     <w:p>
@@ -3101,6 +3446,8 @@
         <w:br/>
         <w:t>.agent/workflows/external-worker.md</w:t>
         <w:br/>
+        <w:t>.agent/workflows/website-update-report.md</w:t>
+        <w:br/>
         <w:t>docs/handbooks/MediaKids-Mac-Owner-Guide.md</w:t>
         <w:br/>
         <w:t>docs/handbooks/MediaKids-Team-Website-Guide.md</w:t>
@@ -3253,7 +3600,7 @@
         <w:pStyle w:val="Heading1"/>
       </w:pPr>
       <w:r>
-        <w:t>11. สิ่งที่ยังควรทำต่อ</w:t>
+        <w:t>12. สิ่งที่ยังควรทำต่อ</w:t>
       </w:r>
     </w:p>
     <w:p>
@@ -3395,7 +3742,7 @@
         <w:pStyle w:val="Heading1"/>
       </w:pPr>
       <w:r>
-        <w:t>12. QA ที่ทำไปแล้ว</w:t>
+        <w:t>13. QA ที่ทำไปแล้ว</w:t>
       </w:r>
     </w:p>
     <w:p>
@@ -3651,7 +3998,7 @@
         <w:pStyle w:val="Heading1"/>
       </w:pPr>
       <w:r>
-        <w:t>13. สรุปสั้นสำหรับ AI ตัวใหม่</w:t>
+        <w:t>14. สรุปสั้นสำหรับ AI ตัวใหม่</w:t>
       </w:r>
     </w:p>
     <w:p>
@@ -3703,7 +4050,7 @@
           <w:color w:val="1D1D1F"/>
           <w:sz w:val="21"/>
         </w:rPr>
-        <w:t>, image inbox/archive folders, และตั้ง GitHub SSH บน Mac เครื่องหลัก</w:t>
+        <w:t>, image inbox/archive folders, ตั้ง GitHub SSH บน Mac เครื่องหลัก และเพิ่มกฎรายงานสรุปส่งหัวหน้าหลังงานเว็บจริง</w:t>
       </w:r>
     </w:p>
     <w:p>

</xml_diff>